<commit_message>
Add plain-text full project list page, linked from the CV
- New project-list.html renders all 22 projects from projects-data.js
  as a scannable numbered list (title, year, role, one-line
  description, itch.io link if available) instead of the image grid,
  so recruiters/ATS reviewers can skim without opening the gallery.
- CV page now links to it alongside the two CV downloads.
- ATS CV's Selected Projects trimmed to 3 (matching the site's
  featured projects, dropping World of Spiretopia) with a link to the
  full list instead of a growing bullet list.
</commit_message>
<xml_diff>
--- a/assets/files/Andry_Purnomo_ATS_CV.docx
+++ b/assets/files/Andry_Purnomo_ATS_CV.docx
@@ -547,24 +547,21 @@
           <w:sz w:val="21"/>
           <w:szCs w:val="21"/>
         </w:rPr>
-        <w:t xml:space="preserve">World of Spiretopia (2021) - Multiplayer shooter tower-builder, Android; IGSI Batch 4 entry.</w:t>
-      </w:r>
-    </w:p>
-    <w:p>
-      <w:pPr>
-        <w:pStyle w:val="ListParagraph"/>
-        <w:numPr>
-          <w:ilvl w:val="0"/>
-          <w:numId w:val="2"/>
-        </w:numPr>
-        <w:spacing w:after="60"/>
-      </w:pPr>
-      <w:r>
-        <w:rPr>
-          <w:sz w:val="21"/>
-          <w:szCs w:val="21"/>
-        </w:rPr>
         <w:t xml:space="preserve">Heroes of Indonesia (2020) - Turn-based card game, Android.</w:t>
+      </w:r>
+    </w:p>
+    <w:p>
+      <w:pPr>
+        <w:spacing w:after="160"/>
+      </w:pPr>
+      <w:r>
+        <w:rPr>
+          <w:i/>
+          <w:iCs/>
+          <w:sz w:val="20"/>
+          <w:szCs w:val="20"/>
+        </w:rPr>
+        <w:t xml:space="preserve">Full project list (22 titles, 2017-2025): https://andryportfolio.github.io/portfolio/project-list.html</w:t>
       </w:r>
     </w:p>
     <w:p>

</xml_diff>

<commit_message>
Embed full 22-project list as an appendix page in the ATS CV
Replaced the "see full list at this URL" line with an actual second
page listing all projects, since ATS parsers commonly strip or ignore
hyperlinks - the content needs to live in the document itself to be
reliably scanned. Pulled from projects-data.js so it can't drift out
of sync with the website's project list.
</commit_message>
<xml_diff>
--- a/assets/files/Andry_Purnomo_ATS_CV.docx
+++ b/assets/files/Andry_Purnomo_ATS_CV.docx
@@ -561,7 +561,7 @@
           <w:sz w:val="20"/>
           <w:szCs w:val="20"/>
         </w:rPr>
-        <w:t xml:space="preserve">Full project list (22 titles, 2017-2025): https://andryportfolio.github.io/portfolio/project-list.html</w:t>
+        <w:t xml:space="preserve">Full list of all 22 projects on the next page.</w:t>
       </w:r>
     </w:p>
     <w:p>
@@ -646,6 +646,404 @@
           <w:szCs w:val="21"/>
         </w:rPr>
         <w:t xml:space="preserve">English - Intermediate</w:t>
+      </w:r>
+    </w:p>
+    <w:p>
+      <w:r>
+        <w:br w:type="page"/>
+      </w:r>
+    </w:p>
+    <w:p>
+      <w:pPr>
+        <w:pStyle w:val="Heading2"/>
+        <w:pBdr>
+          <w:bottom w:val="single" w:color="999999" w:sz="6" w:space="2"/>
+        </w:pBdr>
+        <w:spacing w:after="120" w:before="280"/>
+      </w:pPr>
+      <w:r>
+        <w:rPr>
+          <w:b/>
+          <w:bCs/>
+          <w:color w:val="1F4E5F"/>
+          <w:sz w:val="24"/>
+          <w:szCs w:val="24"/>
+        </w:rPr>
+        <w:t xml:space="preserve">FULL PROJECT LIST (22 PROJECTS, 2017-2025)</w:t>
+      </w:r>
+    </w:p>
+    <w:p>
+      <w:pPr>
+        <w:pStyle w:val="ListParagraph"/>
+        <w:numPr>
+          <w:ilvl w:val="0"/>
+          <w:numId w:val="2"/>
+        </w:numPr>
+        <w:spacing w:after="60"/>
+      </w:pPr>
+      <w:r>
+        <w:rPr>
+          <w:sz w:val="21"/>
+          <w:szCs w:val="21"/>
+        </w:rPr>
+        <w:t xml:space="preserve">Financial Fighter (2025) - Programmer, PC &amp; Browser. A chaotic rogue-like card strategy game where you deploy quirky workers and chain powerful synergies to rescue your company from financial ruin.</w:t>
+      </w:r>
+    </w:p>
+    <w:p>
+      <w:pPr>
+        <w:pStyle w:val="ListParagraph"/>
+        <w:numPr>
+          <w:ilvl w:val="0"/>
+          <w:numId w:val="2"/>
+        </w:numPr>
+        <w:spacing w:after="60"/>
+      </w:pPr>
+      <w:r>
+        <w:rPr>
+          <w:sz w:val="21"/>
+          <w:szCs w:val="21"/>
+        </w:rPr>
+        <w:t xml:space="preserve">Super Duper Space Wizard (2025) - Programmer, PC &amp; Browser. A retro-style wizard battle game.</w:t>
+      </w:r>
+    </w:p>
+    <w:p>
+      <w:pPr>
+        <w:pStyle w:val="ListParagraph"/>
+        <w:numPr>
+          <w:ilvl w:val="0"/>
+          <w:numId w:val="2"/>
+        </w:numPr>
+        <w:spacing w:after="60"/>
+      </w:pPr>
+      <w:r>
+        <w:rPr>
+          <w:sz w:val="21"/>
+          <w:szCs w:val="21"/>
+        </w:rPr>
+        <w:t xml:space="preserve">Spirit of Weapon (2022) - Programmer, Android. A Plant-vs-Zombie-alike tower defense game.</w:t>
+      </w:r>
+    </w:p>
+    <w:p>
+      <w:pPr>
+        <w:pStyle w:val="ListParagraph"/>
+        <w:numPr>
+          <w:ilvl w:val="0"/>
+          <w:numId w:val="2"/>
+        </w:numPr>
+        <w:spacing w:after="60"/>
+      </w:pPr>
+      <w:r>
+        <w:rPr>
+          <w:sz w:val="21"/>
+          <w:szCs w:val="21"/>
+        </w:rPr>
+        <w:t xml:space="preserve">Game Anak (2022) - Programmer, Android. An educational kids game — a snake-and-ladders-alike board game where the target is to be the first to reach the finish line.</w:t>
+      </w:r>
+    </w:p>
+    <w:p>
+      <w:pPr>
+        <w:pStyle w:val="ListParagraph"/>
+        <w:numPr>
+          <w:ilvl w:val="0"/>
+          <w:numId w:val="2"/>
+        </w:numPr>
+        <w:spacing w:after="60"/>
+      </w:pPr>
+      <w:r>
+        <w:rPr>
+          <w:sz w:val="21"/>
+          <w:szCs w:val="21"/>
+        </w:rPr>
+        <w:t xml:space="preserve">Pandemic (2022) - Programmer, PC. An adventure game about a virus that attacked humanity.</w:t>
+      </w:r>
+    </w:p>
+    <w:p>
+      <w:pPr>
+        <w:pStyle w:val="ListParagraph"/>
+        <w:numPr>
+          <w:ilvl w:val="0"/>
+          <w:numId w:val="2"/>
+        </w:numPr>
+        <w:spacing w:after="60"/>
+      </w:pPr>
+      <w:r>
+        <w:rPr>
+          <w:sz w:val="21"/>
+          <w:szCs w:val="21"/>
+        </w:rPr>
+        <w:t xml:space="preserve">World of Spiretopia (2021) - Lead Programmer, Android. A shooter tower-builder game.</w:t>
+      </w:r>
+    </w:p>
+    <w:p>
+      <w:pPr>
+        <w:pStyle w:val="ListParagraph"/>
+        <w:numPr>
+          <w:ilvl w:val="0"/>
+          <w:numId w:val="2"/>
+        </w:numPr>
+        <w:spacing w:after="60"/>
+      </w:pPr>
+      <w:r>
+        <w:rPr>
+          <w:sz w:val="21"/>
+          <w:szCs w:val="21"/>
+        </w:rPr>
+        <w:t xml:space="preserve">Space Invader Reborn (2021) - Whole Role, PC. A mini space shooter game — simple and to the point: kill as many ships as possible and rack up the highest score you can.</w:t>
+      </w:r>
+    </w:p>
+    <w:p>
+      <w:pPr>
+        <w:pStyle w:val="ListParagraph"/>
+        <w:numPr>
+          <w:ilvl w:val="0"/>
+          <w:numId w:val="2"/>
+        </w:numPr>
+        <w:spacing w:after="60"/>
+      </w:pPr>
+      <w:r>
+        <w:rPr>
+          <w:sz w:val="21"/>
+          <w:szCs w:val="21"/>
+        </w:rPr>
+        <w:t xml:space="preserve">Heroes of Indonesia (2020) - Whole Role, Android. A turn-based card game where the target is to beat the last boss while building your deck by buying new cards.</w:t>
+      </w:r>
+    </w:p>
+    <w:p>
+      <w:pPr>
+        <w:pStyle w:val="ListParagraph"/>
+        <w:numPr>
+          <w:ilvl w:val="0"/>
+          <w:numId w:val="2"/>
+        </w:numPr>
+        <w:spacing w:after="60"/>
+      </w:pPr>
+      <w:r>
+        <w:rPr>
+          <w:sz w:val="21"/>
+          <w:szCs w:val="21"/>
+        </w:rPr>
+        <w:t xml:space="preserve">Garda Gerdy (2020) - Programmer, Android. A side-scrolling endless runner set across multiple real locations in Yogyakarta where Garda Gerdy stores are located.</w:t>
+      </w:r>
+    </w:p>
+    <w:p>
+      <w:pPr>
+        <w:pStyle w:val="ListParagraph"/>
+        <w:numPr>
+          <w:ilvl w:val="0"/>
+          <w:numId w:val="2"/>
+        </w:numPr>
+        <w:spacing w:after="60"/>
+      </w:pPr>
+      <w:r>
+        <w:rPr>
+          <w:sz w:val="21"/>
+          <w:szCs w:val="21"/>
+        </w:rPr>
+        <w:t xml:space="preserve">Biovolve: Battle Arena (2019) - Programmer, PC. An online multiplayer battle game set in a post-apocalyptic theme, where players fight as mutated living things on an earth ravaged by pollution.</w:t>
+      </w:r>
+    </w:p>
+    <w:p>
+      <w:pPr>
+        <w:pStyle w:val="ListParagraph"/>
+        <w:numPr>
+          <w:ilvl w:val="0"/>
+          <w:numId w:val="2"/>
+        </w:numPr>
+        <w:spacing w:after="60"/>
+      </w:pPr>
+      <w:r>
+        <w:rPr>
+          <w:sz w:val="21"/>
+          <w:szCs w:val="21"/>
+        </w:rPr>
+        <w:t xml:space="preserve">Elemental Battle (2019) - Programmer, Browser (localhost). A remade casual HTML5 game — guess who wins between two elements based on the tutorial.</w:t>
+      </w:r>
+    </w:p>
+    <w:p>
+      <w:pPr>
+        <w:pStyle w:val="ListParagraph"/>
+        <w:numPr>
+          <w:ilvl w:val="0"/>
+          <w:numId w:val="2"/>
+        </w:numPr>
+        <w:spacing w:after="60"/>
+      </w:pPr>
+      <w:r>
+        <w:rPr>
+          <w:sz w:val="21"/>
+          <w:szCs w:val="21"/>
+        </w:rPr>
+        <w:t xml:space="preserve">Arrow Shooter Game (2019) - Programmer, Browser (localhost). A remade casual HTML5 game — shoot the enemy until it's gone while keeping it away from the green bar below.</w:t>
+      </w:r>
+    </w:p>
+    <w:p>
+      <w:pPr>
+        <w:pStyle w:val="ListParagraph"/>
+        <w:numPr>
+          <w:ilvl w:val="0"/>
+          <w:numId w:val="2"/>
+        </w:numPr>
+        <w:spacing w:after="60"/>
+      </w:pPr>
+      <w:r>
+        <w:rPr>
+          <w:sz w:val="21"/>
+          <w:szCs w:val="21"/>
+        </w:rPr>
+        <w:t xml:space="preserve">Knife Hit Remake (2019) - Programmer, Browser (localhost). A remade casual HTML5 game — hit the enemy until the arrow count drops to zero.</w:t>
+      </w:r>
+    </w:p>
+    <w:p>
+      <w:pPr>
+        <w:pStyle w:val="ListParagraph"/>
+        <w:numPr>
+          <w:ilvl w:val="0"/>
+          <w:numId w:val="2"/>
+        </w:numPr>
+        <w:spacing w:after="60"/>
+      </w:pPr>
+      <w:r>
+        <w:rPr>
+          <w:sz w:val="21"/>
+          <w:szCs w:val="21"/>
+        </w:rPr>
+        <w:t xml:space="preserve">Better Knife Hit (2019) - Programmer, Browser (localhost). Same core idea as Knife Hit — hit the enemy until the arrow count drops to zero — but built from an entirely different, physics-free codebase.</w:t>
+      </w:r>
+    </w:p>
+    <w:p>
+      <w:pPr>
+        <w:pStyle w:val="ListParagraph"/>
+        <w:numPr>
+          <w:ilvl w:val="0"/>
+          <w:numId w:val="2"/>
+        </w:numPr>
+        <w:spacing w:after="60"/>
+      </w:pPr>
+      <w:r>
+        <w:rPr>
+          <w:sz w:val="21"/>
+          <w:szCs w:val="21"/>
+        </w:rPr>
+        <w:t xml:space="preserve">Prototype Kinect &amp; VR Rhythm Game (2019) - Programmer, VR / Kinect. A rhythm game prototype created to explore and learn how VR and Kinect input work.</w:t>
+      </w:r>
+    </w:p>
+    <w:p>
+      <w:pPr>
+        <w:pStyle w:val="ListParagraph"/>
+        <w:numPr>
+          <w:ilvl w:val="0"/>
+          <w:numId w:val="2"/>
+        </w:numPr>
+        <w:spacing w:after="60"/>
+      </w:pPr>
+      <w:r>
+        <w:rPr>
+          <w:sz w:val="21"/>
+          <w:szCs w:val="21"/>
+        </w:rPr>
+        <w:t xml:space="preserve">Login (2018) - Programmer, PC. Tells the story of a schoolboy trapped inside a game world full of bullying, mixing puzzle, fighting, and adventure mechanics.</w:t>
+      </w:r>
+    </w:p>
+    <w:p>
+      <w:pPr>
+        <w:pStyle w:val="ListParagraph"/>
+        <w:numPr>
+          <w:ilvl w:val="0"/>
+          <w:numId w:val="2"/>
+        </w:numPr>
+        <w:spacing w:after="60"/>
+      </w:pPr>
+      <w:r>
+        <w:rPr>
+          <w:sz w:val="21"/>
+          <w:szCs w:val="21"/>
+        </w:rPr>
+        <w:t xml:space="preserve">Prototype Air-Strike Game (2018) - Whole Role, PC. A shooter prototype telling the story of an alien invasion of Earth, featuring the ability to transform into objects found on Earth.</w:t>
+      </w:r>
+    </w:p>
+    <w:p>
+      <w:pPr>
+        <w:pStyle w:val="ListParagraph"/>
+        <w:numPr>
+          <w:ilvl w:val="0"/>
+          <w:numId w:val="2"/>
+        </w:numPr>
+        <w:spacing w:after="60"/>
+      </w:pPr>
+      <w:r>
+        <w:rPr>
+          <w:sz w:val="21"/>
+          <w:szCs w:val="21"/>
+        </w:rPr>
+        <w:t xml:space="preserve">Bingo Board (2018) - Whole Role, PC. Not a game, but a quiz-competition application (Lomba Cerdas Cermat) built for FACTION #3 at Sanata Dharma University.</w:t>
+      </w:r>
+    </w:p>
+    <w:p>
+      <w:pPr>
+        <w:pStyle w:val="ListParagraph"/>
+        <w:numPr>
+          <w:ilvl w:val="0"/>
+          <w:numId w:val="2"/>
+        </w:numPr>
+        <w:spacing w:after="60"/>
+      </w:pPr>
+      <w:r>
+        <w:rPr>
+          <w:sz w:val="21"/>
+          <w:szCs w:val="21"/>
+        </w:rPr>
+        <w:t xml:space="preserve">Artefact Defender (2017) - Programmer, PC. A tower defense game where players must guard ancient artefacts from demons trying to steal and destroy them.</w:t>
+      </w:r>
+    </w:p>
+    <w:p>
+      <w:pPr>
+        <w:pStyle w:val="ListParagraph"/>
+        <w:numPr>
+          <w:ilvl w:val="0"/>
+          <w:numId w:val="2"/>
+        </w:numPr>
+        <w:spacing w:after="60"/>
+      </w:pPr>
+      <w:r>
+        <w:rPr>
+          <w:sz w:val="21"/>
+          <w:szCs w:val="21"/>
+        </w:rPr>
+        <w:t xml:space="preserve">Prototype E-Magazine (2017) - Whole Role, PC. Not a game — a self-directed attempt at building an interactive e-magazine application.</w:t>
+      </w:r>
+    </w:p>
+    <w:p>
+      <w:pPr>
+        <w:pStyle w:val="ListParagraph"/>
+        <w:numPr>
+          <w:ilvl w:val="0"/>
+          <w:numId w:val="2"/>
+        </w:numPr>
+        <w:spacing w:after="60"/>
+      </w:pPr>
+      <w:r>
+        <w:rPr>
+          <w:sz w:val="21"/>
+          <w:szCs w:val="21"/>
+        </w:rPr>
+        <w:t xml:space="preserve">Bob's Adventure (2017) - Programmer, PC. A 2D side-scrolling platform adventure game — and the very first game I ever made.</w:t>
+      </w:r>
+    </w:p>
+    <w:p>
+      <w:pPr>
+        <w:pStyle w:val="ListParagraph"/>
+        <w:numPr>
+          <w:ilvl w:val="0"/>
+          <w:numId w:val="2"/>
+        </w:numPr>
+        <w:spacing w:after="60"/>
+      </w:pPr>
+      <w:r>
+        <w:rPr>
+          <w:sz w:val="21"/>
+          <w:szCs w:val="21"/>
+        </w:rPr>
+        <w:t xml:space="preserve">Career Mastery (2017) - Whole Role, Physical Board Game. A physical strategy board game I designed and built myself: make your way to clear your quest while others try to stop you.</w:t>
       </w:r>
     </w:p>
     <w:sectPr>

</xml_diff>